<commit_message>
Add recurring giving and update site documents
</commit_message>
<xml_diff>
--- a/letters/Hope-Sojourns-Giving-Letter.docx
+++ b/letters/Hope-Sojourns-Giving-Letter.docx
@@ -7,6 +7,64 @@
         <w:spacing w:after="0"/>
         <w:jc w:val="center"/>
       </w:pPr>
+      <w:r>
+        <w:rPr>
+          <w:noProof/>
+        </w:rPr>
+        <w:drawing>
+          <wp:anchor distT="0" distB="0" distL="101600" distR="0" simplePos="0" relativeHeight="251658240" behindDoc="0" locked="0" layoutInCell="1" allowOverlap="1" wp14:anchorId="0A707853" wp14:editId="557D6E71">
+            <wp:simplePos x="0" y="0"/>
+            <wp:positionH relativeFrom="page">
+              <wp:posOffset>5972175</wp:posOffset>
+            </wp:positionH>
+            <wp:positionV relativeFrom="page">
+              <wp:posOffset>7210425</wp:posOffset>
+            </wp:positionV>
+            <wp:extent cx="1051560" cy="1160780"/>
+            <wp:effectExtent l="0" t="0" r="0" b="1270"/>
+            <wp:wrapSquare wrapText="left"/>
+            <wp:docPr id="545709437" name="HopeSojournsGivingQR" descr="QR code for the Hope Sojourns giving page" title="Hope Sojourns Giving Page">
+              <a:hlinkClick xmlns:a="http://schemas.openxmlformats.org/drawingml/2006/main" r:id="rId8"/>
+            </wp:docPr>
+            <wp:cNvGraphicFramePr>
+              <a:graphicFrameLocks xmlns:a="http://schemas.openxmlformats.org/drawingml/2006/main" noChangeAspect="1"/>
+            </wp:cNvGraphicFramePr>
+            <a:graphic xmlns:a="http://schemas.openxmlformats.org/drawingml/2006/main">
+              <a:graphicData uri="http://schemas.openxmlformats.org/drawingml/2006/picture">
+                <pic:pic xmlns:pic="http://schemas.openxmlformats.org/drawingml/2006/picture">
+                  <pic:nvPicPr>
+                    <pic:cNvPr id="545709437" name="HopeSojournsGivingQR" descr="QR code for the Hope Sojourns giving page" title="Hope Sojourns Giving Page">
+                      <a:hlinkClick r:id="rId8"/>
+                    </pic:cNvPr>
+                    <pic:cNvPicPr/>
+                  </pic:nvPicPr>
+                  <pic:blipFill>
+                    <a:blip r:embed="rId9"/>
+                    <a:stretch>
+                      <a:fillRect/>
+                    </a:stretch>
+                  </pic:blipFill>
+                  <pic:spPr>
+                    <a:xfrm>
+                      <a:off x="0" y="0"/>
+                      <a:ext cx="1051560" cy="1160780"/>
+                    </a:xfrm>
+                    <a:prstGeom prst="rect">
+                      <a:avLst/>
+                    </a:prstGeom>
+                  </pic:spPr>
+                </pic:pic>
+              </a:graphicData>
+            </a:graphic>
+            <wp14:sizeRelH relativeFrom="margin">
+              <wp14:pctWidth>0</wp14:pctWidth>
+            </wp14:sizeRelH>
+            <wp14:sizeRelV relativeFrom="margin">
+              <wp14:pctHeight>0</wp14:pctHeight>
+            </wp14:sizeRelV>
+          </wp:anchor>
+        </w:drawing>
+      </w:r>
       <w:r>
         <w:rPr>
           <w:noProof/>
@@ -27,7 +85,7 @@
                     <pic:cNvPicPr/>
                   </pic:nvPicPr>
                   <pic:blipFill>
-                    <a:blip r:embed="rId8"/>
+                    <a:blip r:embed="rId10"/>
                     <a:stretch>
                       <a:fillRect/>
                     </a:stretch>
@@ -60,7 +118,7 @@
         </w:rPr>
         <w:t xml:space="preserve">9408 Harrell Dr | McKinney, TX 75072 | 972-505-0171 | </w:t>
       </w:r>
-      <w:hyperlink r:id="rId9">
+      <w:hyperlink r:id="rId11">
         <w:r>
           <w:rPr>
             <w:color w:val="0B3D2E"/>
@@ -76,7 +134,7 @@
         <w:spacing w:after="140" w:line="240" w:lineRule="auto"/>
         <w:jc w:val="center"/>
       </w:pPr>
-      <w:hyperlink r:id="rId10">
+      <w:hyperlink r:id="rId12">
         <w:r>
           <w:rPr>
             <w:color w:val="0B3D2E"/>
@@ -132,10 +190,13 @@
         <w:keepLines/>
       </w:pPr>
       <w:r>
-        <w:t>This vision is already taking shape. A 2027 Athens journey will build on mission trips completed in 2025 and 2026, serving alongside ministries caring for people experiencing homelessness, displacement, and exploitation. We are also helping develop six Mexico City mission opportunities for 2027, including collaboration with Metro Relief of Dallas and its trusted sister ministry serving neighbors experiencing homelessness. Additional opportunities include Vacation Bible School ministry in Belize and Nice, as</w:t>
+        <w:t xml:space="preserve">This vision is already taking shape. A 2027 Athens journey will build on mission trips completed in 2025 and 2026, serving alongside ministries caring for people experiencing homelessness, displacement, and exploitation. We are also helping develop six Mexico City mission opportunities </w:t>
       </w:r>
       <w:r>
-        <w:t xml:space="preserve"> well as service in Kenya and Arkansas.</w:t>
+        <w:t>starting in October of this year</w:t>
+      </w:r>
+      <w:r>
+        <w:t>, including collaboration with Metro Relief of Dallas and its trusted sister ministry serving neighbors experiencing homelessness. Additional opportunities include Vacation Bible School ministry in Belize and Nice, as well as service in Kenya and Arkansas.</w:t>
       </w:r>
     </w:p>
     <w:p>
@@ -159,7 +220,7 @@
       <w:r>
         <w:t xml:space="preserve">You can give securely at </w:t>
       </w:r>
-      <w:hyperlink r:id="rId11">
+      <w:hyperlink r:id="rId13">
         <w:r>
           <w:rPr>
             <w:color w:val="0B5A46"/>
@@ -267,7 +328,7 @@
         </w:rPr>
         <w:t xml:space="preserve">Your gift helps Hope Sojourns build responsible, lasting partnerships that connect willing people with trusted ministries. To learn more or give, visit </w:t>
       </w:r>
-      <w:hyperlink r:id="rId12">
+      <w:hyperlink r:id="rId14">
         <w:r>
           <w:rPr>
             <w:color w:val="0B3D2E"/>
@@ -286,7 +347,7 @@
       </w:r>
     </w:p>
     <w:sectPr>
-      <w:footerReference w:type="default" r:id="rId13"/>
+      <w:footerReference w:type="default" r:id="rId15"/>
       <w:pgSz w:w="12240" w:h="15840"/>
       <w:pgMar w:top="893" w:right="1181" w:bottom="893" w:left="1181" w:header="432" w:footer="432" w:gutter="0"/>
       <w:cols w:space="720"/>
@@ -337,14 +398,7 @@
         <w:b/>
         <w:i/>
       </w:rPr>
-      <w:t xml:space="preserve">Hope Sojourns (DBA) - </w:t>
-    </w:r>
-    <w:r>
-      <w:rPr>
-        <w:b/>
-        <w:i/>
-      </w:rPr>
-      <w:t>Christian Steps Ministries</w:t>
+      <w:t>Hope Sojourns (DBA) - Christian Steps Ministries</w:t>
     </w:r>
     <w:r>
       <w:rPr>
@@ -384,19 +438,39 @@
       <w:pStyle w:val="Footer"/>
       <w:jc w:val="center"/>
       <w:rPr>
-        <w:sz w:val="20"/>
-        <w:szCs w:val="20"/>
-      </w:rPr>
-    </w:pPr>
-    <w:r>
-      <w:rPr>
         <w:rStyle w:val="Hyperlink"/>
         <w:color w:val="auto"/>
         <w:sz w:val="20"/>
         <w:szCs w:val="20"/>
         <w:u w:val="none"/>
       </w:rPr>
+    </w:pPr>
+    <w:r>
+      <w:rPr>
+        <w:rStyle w:val="Hyperlink"/>
+        <w:color w:val="auto"/>
+        <w:sz w:val="20"/>
+        <w:szCs w:val="20"/>
+        <w:u w:val="none"/>
+      </w:rPr>
       <w:t>Officers: Brent D Kern (President) Matt Steel (Vice President) Renee Steel (Secretary) Corrie Kern (Treasurer)</w:t>
+    </w:r>
+  </w:p>
+  <w:p>
+    <w:pPr>
+      <w:pStyle w:val="Footer"/>
+      <w:jc w:val="center"/>
+      <w:rPr>
+        <w:sz w:val="20"/>
+        <w:szCs w:val="20"/>
+      </w:rPr>
+    </w:pPr>
+    <w:r>
+      <w:rPr>
+        <w:sz w:val="20"/>
+        <w:szCs w:val="20"/>
+      </w:rPr>
+      <w:t>WitLooL™ | Working in the Light of our Lord | A Christian Steps Ministries trademark</w:t>
     </w:r>
   </w:p>
   <w:p>

</xml_diff>

<commit_message>
Build internship program and synchronize site documents
</commit_message>
<xml_diff>
--- a/letters/Hope-Sojourns-Giving-Letter.docx
+++ b/letters/Hope-Sojourns-Giving-Letter.docx
@@ -12,65 +12,7 @@
           <w:noProof/>
         </w:rPr>
         <w:drawing>
-          <wp:anchor distT="0" distB="0" distL="101600" distR="0" simplePos="0" relativeHeight="251658240" behindDoc="0" locked="0" layoutInCell="1" allowOverlap="1" wp14:anchorId="0A707853" wp14:editId="557D6E71">
-            <wp:simplePos x="0" y="0"/>
-            <wp:positionH relativeFrom="page">
-              <wp:posOffset>5972175</wp:posOffset>
-            </wp:positionH>
-            <wp:positionV relativeFrom="page">
-              <wp:posOffset>7210425</wp:posOffset>
-            </wp:positionV>
-            <wp:extent cx="1051560" cy="1160780"/>
-            <wp:effectExtent l="0" t="0" r="0" b="1270"/>
-            <wp:wrapSquare wrapText="left"/>
-            <wp:docPr id="545709437" name="HopeSojournsGivingQR" descr="QR code for the Hope Sojourns giving page" title="Hope Sojourns Giving Page">
-              <a:hlinkClick xmlns:a="http://schemas.openxmlformats.org/drawingml/2006/main" r:id="rId8"/>
-            </wp:docPr>
-            <wp:cNvGraphicFramePr>
-              <a:graphicFrameLocks xmlns:a="http://schemas.openxmlformats.org/drawingml/2006/main" noChangeAspect="1"/>
-            </wp:cNvGraphicFramePr>
-            <a:graphic xmlns:a="http://schemas.openxmlformats.org/drawingml/2006/main">
-              <a:graphicData uri="http://schemas.openxmlformats.org/drawingml/2006/picture">
-                <pic:pic xmlns:pic="http://schemas.openxmlformats.org/drawingml/2006/picture">
-                  <pic:nvPicPr>
-                    <pic:cNvPr id="545709437" name="HopeSojournsGivingQR" descr="QR code for the Hope Sojourns giving page" title="Hope Sojourns Giving Page">
-                      <a:hlinkClick r:id="rId8"/>
-                    </pic:cNvPr>
-                    <pic:cNvPicPr/>
-                  </pic:nvPicPr>
-                  <pic:blipFill>
-                    <a:blip r:embed="rId9"/>
-                    <a:stretch>
-                      <a:fillRect/>
-                    </a:stretch>
-                  </pic:blipFill>
-                  <pic:spPr>
-                    <a:xfrm>
-                      <a:off x="0" y="0"/>
-                      <a:ext cx="1051560" cy="1160780"/>
-                    </a:xfrm>
-                    <a:prstGeom prst="rect">
-                      <a:avLst/>
-                    </a:prstGeom>
-                  </pic:spPr>
-                </pic:pic>
-              </a:graphicData>
-            </a:graphic>
-            <wp14:sizeRelH relativeFrom="margin">
-              <wp14:pctWidth>0</wp14:pctWidth>
-            </wp14:sizeRelH>
-            <wp14:sizeRelV relativeFrom="margin">
-              <wp14:pctHeight>0</wp14:pctHeight>
-            </wp14:sizeRelV>
-          </wp:anchor>
-        </w:drawing>
-      </w:r>
-      <w:r>
-        <w:rPr>
-          <w:noProof/>
-        </w:rPr>
-        <w:drawing>
-          <wp:inline distT="0" distB="0" distL="0" distR="0" wp14:anchorId="198A6AD2" wp14:editId="6E30B841">
+          <wp:inline distT="0" distB="0" distL="0" distR="0" wp14:anchorId="198A6AD2" wp14:editId="430EAF30">
             <wp:extent cx="2029968" cy="1131332"/>
             <wp:effectExtent l="0" t="0" r="0" b="0"/>
             <wp:docPr id="1" name="Picture 1" descr="Hope Sojourns - Go with Hope. Serve with Faith."/>
@@ -85,7 +27,7 @@
                     <pic:cNvPicPr/>
                   </pic:nvPicPr>
                   <pic:blipFill>
-                    <a:blip r:embed="rId10"/>
+                    <a:blip r:embed="rId8"/>
                     <a:stretch>
                       <a:fillRect/>
                     </a:stretch>
@@ -110,15 +52,32 @@
       <w:pPr>
         <w:spacing w:after="0" w:line="240" w:lineRule="auto"/>
         <w:jc w:val="center"/>
+        <w:rPr>
+          <w:color w:val="5A5A5A"/>
+          <w:sz w:val="17"/>
+        </w:rPr>
       </w:pPr>
       <w:r>
         <w:rPr>
           <w:color w:val="5A5A5A"/>
           <w:sz w:val="17"/>
         </w:rPr>
-        <w:t xml:space="preserve">9408 Harrell Dr | McKinney, TX 75072 | 972-505-0171 | </w:t>
+        <w:t>9408 Harrell Dr | McKinney, TX 75072 | 972-505-0171 |</w:t>
       </w:r>
-      <w:hyperlink r:id="rId11">
+    </w:p>
+    <w:p>
+      <w:pPr>
+        <w:spacing w:after="0" w:line="240" w:lineRule="auto"/>
+        <w:jc w:val="center"/>
+      </w:pPr>
+      <w:r>
+        <w:rPr>
+          <w:color w:val="5A5A5A"/>
+          <w:sz w:val="17"/>
+        </w:rPr>
+        <w:t xml:space="preserve"> </w:t>
+      </w:r>
+      <w:hyperlink r:id="rId9">
         <w:r>
           <w:rPr>
             <w:color w:val="0B3D2E"/>
@@ -128,13 +87,10 @@
           <w:t>kernbrent@gmail.com</w:t>
         </w:r>
       </w:hyperlink>
-    </w:p>
-    <w:p>
-      <w:pPr>
-        <w:spacing w:after="140" w:line="240" w:lineRule="auto"/>
-        <w:jc w:val="center"/>
-      </w:pPr>
-      <w:hyperlink r:id="rId12">
+      <w:r>
+        <w:t xml:space="preserve"> </w:t>
+      </w:r>
+      <w:hyperlink r:id="rId10">
         <w:r>
           <w:rPr>
             <w:color w:val="0B3D2E"/>
@@ -149,30 +105,98 @@
       <w:pPr>
         <w:keepLines/>
         <w:spacing w:after="100" w:line="240" w:lineRule="auto"/>
+        <w:rPr>
+          <w:rFonts w:ascii="Arial Nova Cond" w:hAnsi="Arial Nova Cond"/>
+          <w:sz w:val="24"/>
+          <w:szCs w:val="24"/>
+        </w:rPr>
+      </w:pPr>
+    </w:p>
+    <w:p>
+      <w:pPr>
+        <w:keepLines/>
+        <w:spacing w:before="120" w:after="120" w:line="240" w:lineRule="auto"/>
+        <w:rPr>
+          <w:rFonts w:ascii="Arial Nova Cond" w:hAnsi="Arial Nova Cond"/>
+          <w:sz w:val="28"/>
+          <w:szCs w:val="28"/>
+        </w:rPr>
       </w:pPr>
       <w:r>
+        <w:rPr>
+          <w:rFonts w:ascii="Arial Nova Cond" w:hAnsi="Arial Nova Cond"/>
+          <w:sz w:val="28"/>
+          <w:szCs w:val="28"/>
+        </w:rPr>
         <w:t>August 11, 2026</w:t>
       </w:r>
     </w:p>
     <w:p>
       <w:pPr>
         <w:keepLines/>
-        <w:spacing w:after="100" w:line="240" w:lineRule="auto"/>
+        <w:spacing w:before="120" w:after="120" w:line="130" w:lineRule="exact"/>
+        <w:rPr>
+          <w:rFonts w:ascii="Arial Nova Cond" w:hAnsi="Arial Nova Cond"/>
+          <w:sz w:val="28"/>
+          <w:szCs w:val="28"/>
+        </w:rPr>
+      </w:pPr>
+    </w:p>
+    <w:p>
+      <w:pPr>
+        <w:keepLines/>
+        <w:spacing w:before="120" w:after="120" w:line="240" w:lineRule="auto"/>
+        <w:rPr>
+          <w:rFonts w:ascii="Arial Nova Cond" w:hAnsi="Arial Nova Cond"/>
+          <w:sz w:val="28"/>
+          <w:szCs w:val="28"/>
+        </w:rPr>
       </w:pPr>
       <w:r>
+        <w:rPr>
+          <w:rFonts w:ascii="Arial Nova Cond" w:hAnsi="Arial Nova Cond"/>
+          <w:sz w:val="28"/>
+          <w:szCs w:val="28"/>
+        </w:rPr>
         <w:t>Dear Friend,</w:t>
       </w:r>
     </w:p>
     <w:p>
       <w:pPr>
         <w:keepLines/>
+        <w:spacing w:before="120" w:after="120" w:line="130" w:lineRule="exact"/>
+        <w:rPr>
+          <w:rFonts w:ascii="Arial Nova Cond" w:hAnsi="Arial Nova Cond"/>
+          <w:sz w:val="28"/>
+          <w:szCs w:val="28"/>
+        </w:rPr>
+      </w:pPr>
+    </w:p>
+    <w:p>
+      <w:pPr>
+        <w:keepLines/>
+        <w:spacing w:before="120" w:after="120" w:line="240" w:lineRule="auto"/>
+        <w:rPr>
+          <w:rFonts w:ascii="Arial Nova Cond" w:hAnsi="Arial Nova Cond"/>
+          <w:b/>
+          <w:sz w:val="28"/>
+          <w:szCs w:val="28"/>
+        </w:rPr>
       </w:pPr>
       <w:r>
+        <w:rPr>
+          <w:rFonts w:ascii="Arial Nova Cond" w:hAnsi="Arial Nova Cond"/>
+          <w:sz w:val="28"/>
+          <w:szCs w:val="28"/>
+        </w:rPr>
         <w:t xml:space="preserve">If you have known me for any length of time, you know that I bring my whole heart, energy, and experience to whatever the Lord places before me. Today I want to share an endeavor that brings together 32 years of church service, more than 28 years of leadership in business, and a lifetime of travel and relationship-building: </w:t>
       </w:r>
       <w:r>
         <w:rPr>
+          <w:rFonts w:ascii="Arial Nova Cond" w:hAnsi="Arial Nova Cond"/>
           <w:b/>
+          <w:sz w:val="28"/>
+          <w:szCs w:val="28"/>
         </w:rPr>
         <w:t>Hope Sojourns.</w:t>
       </w:r>
@@ -180,86 +204,467 @@
     <w:p>
       <w:pPr>
         <w:keepLines/>
+        <w:spacing w:before="120" w:after="120" w:line="130" w:lineRule="exact"/>
+        <w:rPr>
+          <w:rFonts w:ascii="Arial Nova Cond" w:hAnsi="Arial Nova Cond"/>
+          <w:sz w:val="28"/>
+          <w:szCs w:val="28"/>
+        </w:rPr>
+      </w:pPr>
+    </w:p>
+    <w:p>
+      <w:pPr>
+        <w:keepLines/>
+        <w:spacing w:before="120" w:after="120" w:line="240" w:lineRule="auto"/>
+        <w:rPr>
+          <w:rFonts w:ascii="Arial Nova Cond" w:hAnsi="Arial Nova Cond"/>
+          <w:sz w:val="28"/>
+          <w:szCs w:val="28"/>
+        </w:rPr>
       </w:pPr>
       <w:r>
-        <w:t>Hope Sojourns brings willing people alongside trusted local ministries - creating room to listen, learn, encourage, and meet practical needs. This is not mission tourism. Each journey begins with the priorities of people already serving their communities. We prepare teams to arrive with humility, serve under local leadership, and carry what they learn into a lifetime of faithful service.</w:t>
+        <w:rPr>
+          <w:rFonts w:ascii="Arial Nova Cond" w:hAnsi="Arial Nova Cond"/>
+          <w:sz w:val="28"/>
+          <w:szCs w:val="28"/>
+        </w:rPr>
+        <w:t>Hope Sojourns brings willing people alongside trusted local ministries</w:t>
+      </w:r>
+      <w:r>
+        <w:rPr>
+          <w:rFonts w:ascii="Arial Nova Cond" w:hAnsi="Arial Nova Cond"/>
+          <w:sz w:val="28"/>
+          <w:szCs w:val="28"/>
+        </w:rPr>
+        <w:t xml:space="preserve"> to meet practical needs on the ground.</w:t>
+      </w:r>
+      <w:r>
+        <w:rPr>
+          <w:rFonts w:ascii="Arial Nova Cond" w:hAnsi="Arial Nova Cond"/>
+          <w:sz w:val="28"/>
+          <w:szCs w:val="28"/>
+        </w:rPr>
+        <w:t xml:space="preserve"> Our participants l</w:t>
+      </w:r>
+      <w:r>
+        <w:rPr>
+          <w:rFonts w:ascii="Arial Nova Cond" w:hAnsi="Arial Nova Cond"/>
+          <w:sz w:val="28"/>
+          <w:szCs w:val="28"/>
+        </w:rPr>
+        <w:t xml:space="preserve">isten, learn, encourage, and </w:t>
+      </w:r>
+      <w:r>
+        <w:rPr>
+          <w:rFonts w:ascii="Arial Nova Cond" w:hAnsi="Arial Nova Cond"/>
+          <w:sz w:val="28"/>
+          <w:szCs w:val="28"/>
+        </w:rPr>
+        <w:t>share the love of God with those in need</w:t>
+      </w:r>
+      <w:r>
+        <w:rPr>
+          <w:rFonts w:ascii="Arial Nova Cond" w:hAnsi="Arial Nova Cond"/>
+          <w:sz w:val="28"/>
+          <w:szCs w:val="28"/>
+        </w:rPr>
+        <w:t>. This is not mission tourism. Each journey begins with</w:t>
+      </w:r>
+      <w:r>
+        <w:rPr>
+          <w:rFonts w:ascii="Arial Nova Cond" w:hAnsi="Arial Nova Cond"/>
+          <w:sz w:val="28"/>
+          <w:szCs w:val="28"/>
+        </w:rPr>
+        <w:t xml:space="preserve"> consideration for how to best support</w:t>
+      </w:r>
+      <w:r>
+        <w:rPr>
+          <w:rFonts w:ascii="Arial Nova Cond" w:hAnsi="Arial Nova Cond"/>
+          <w:sz w:val="28"/>
+          <w:szCs w:val="28"/>
+        </w:rPr>
+        <w:t xml:space="preserve"> the priorities of people already serving their communities. We prepare teams to arrive with humility, serve under local leadership, and carry what they learn into a lifetime of faithful service.</w:t>
       </w:r>
     </w:p>
     <w:p>
       <w:pPr>
         <w:keepLines/>
+        <w:spacing w:before="120" w:after="120" w:line="130" w:lineRule="exact"/>
+        <w:rPr>
+          <w:rFonts w:ascii="Arial Nova Cond" w:hAnsi="Arial Nova Cond"/>
+          <w:sz w:val="28"/>
+          <w:szCs w:val="28"/>
+        </w:rPr>
+      </w:pPr>
+    </w:p>
+    <w:p>
+      <w:pPr>
+        <w:keepLines/>
+        <w:spacing w:before="120" w:after="120" w:line="240" w:lineRule="auto"/>
+        <w:rPr>
+          <w:rFonts w:ascii="Arial Nova Cond" w:hAnsi="Arial Nova Cond"/>
+          <w:sz w:val="28"/>
+          <w:szCs w:val="28"/>
+        </w:rPr>
       </w:pPr>
       <w:r>
-        <w:t xml:space="preserve">This vision is already taking shape. A 2027 Athens journey will build on mission trips completed in 2025 and 2026, serving alongside ministries caring for people experiencing homelessness, displacement, and exploitation. We are also helping develop six Mexico City mission opportunities </w:t>
+        <w:rPr>
+          <w:rFonts w:ascii="Arial Nova Cond" w:hAnsi="Arial Nova Cond"/>
+          <w:sz w:val="28"/>
+          <w:szCs w:val="28"/>
+        </w:rPr>
+        <w:t xml:space="preserve">This vision is already taking shape. A 2027 Athens journey will </w:t>
+      </w:r>
+      <w:proofErr w:type="gramStart"/>
+      <w:r>
+        <w:rPr>
+          <w:rFonts w:ascii="Arial Nova Cond" w:hAnsi="Arial Nova Cond"/>
+          <w:sz w:val="28"/>
+          <w:szCs w:val="28"/>
+        </w:rPr>
+        <w:t>build</w:t>
+      </w:r>
+      <w:proofErr w:type="gramEnd"/>
+      <w:r>
+        <w:rPr>
+          <w:rFonts w:ascii="Arial Nova Cond" w:hAnsi="Arial Nova Cond"/>
+          <w:sz w:val="28"/>
+          <w:szCs w:val="28"/>
+        </w:rPr>
+        <w:t xml:space="preserve"> on mission trips completed in 2025 and 2026</w:t>
       </w:r>
       <w:r>
-        <w:t>starting in October of this year</w:t>
+        <w:rPr>
+          <w:rFonts w:ascii="Arial Nova Cond" w:hAnsi="Arial Nova Cond"/>
+          <w:sz w:val="28"/>
+          <w:szCs w:val="28"/>
+        </w:rPr>
+        <w:t xml:space="preserve">. These participants will be </w:t>
       </w:r>
       <w:r>
-        <w:t>, including collaboration with Metro Relief of Dallas and its trusted sister ministry serving neighbors experiencing homelessness. Additional opportunities include Vacation Bible School ministry in Belize and Nice, as well as service in Kenya and Arkansas.</w:t>
+        <w:rPr>
+          <w:rFonts w:ascii="Arial Nova Cond" w:hAnsi="Arial Nova Cond"/>
+          <w:sz w:val="28"/>
+          <w:szCs w:val="28"/>
+        </w:rPr>
+        <w:t xml:space="preserve">serving alongside ministries caring for people experiencing homelessness, displacement, and exploitation. We are also helping develop six Mexico City mission opportunities </w:t>
+      </w:r>
+      <w:r>
+        <w:rPr>
+          <w:rFonts w:ascii="Arial Nova Cond" w:hAnsi="Arial Nova Cond"/>
+          <w:sz w:val="28"/>
+          <w:szCs w:val="28"/>
+        </w:rPr>
+        <w:t>starting in January of 2027</w:t>
+      </w:r>
+      <w:r>
+        <w:rPr>
+          <w:rFonts w:ascii="Arial Nova Cond" w:hAnsi="Arial Nova Cond"/>
+          <w:sz w:val="28"/>
+          <w:szCs w:val="28"/>
+        </w:rPr>
+        <w:t>, including collaboration with Metro Relief of Dallas and its trusted sister ministry serving neighbors experiencing homelessness. Additional opportunities include Belize - Nice, France - Kenya - Harriet, Arkansas - and more.</w:t>
+      </w:r>
+      <w:r>
+        <w:rPr>
+          <w:rFonts w:ascii="Arial Nova Cond" w:hAnsi="Arial Nova Cond"/>
+          <w:sz w:val="28"/>
+          <w:szCs w:val="28"/>
+        </w:rPr>
+      </w:r>
+      <w:r>
+        <w:rPr>
+          <w:rFonts w:ascii="Arial Nova Cond" w:hAnsi="Arial Nova Cond"/>
+          <w:sz w:val="28"/>
+          <w:szCs w:val="28"/>
+        </w:rPr>
+      </w:r>
+      <w:r>
+        <w:rPr>
+          <w:rFonts w:ascii="Arial Nova Cond" w:hAnsi="Arial Nova Cond"/>
+          <w:sz w:val="28"/>
+          <w:szCs w:val="28"/>
+        </w:rPr>
+      </w:r>
+      <w:r>
+        <w:rPr>
+          <w:rFonts w:ascii="Arial Nova Cond" w:hAnsi="Arial Nova Cond"/>
+          <w:sz w:val="28"/>
+          <w:szCs w:val="28"/>
+        </w:rPr>
+      </w:r>
+      <w:r>
+        <w:rPr>
+          <w:rFonts w:ascii="Arial Nova Cond" w:hAnsi="Arial Nova Cond"/>
+          <w:sz w:val="28"/>
+          <w:szCs w:val="28"/>
+        </w:rPr>
+      </w:r>
+      <w:r>
+        <w:rPr>
+          <w:rFonts w:ascii="Arial Nova Cond" w:hAnsi="Arial Nova Cond"/>
+          <w:sz w:val="28"/>
+          <w:szCs w:val="28"/>
+        </w:rPr>
+      </w:r>
+      <w:r>
+        <w:rPr>
+          <w:rFonts w:ascii="Arial Nova Cond" w:hAnsi="Arial Nova Cond"/>
+          <w:sz w:val="28"/>
+          <w:szCs w:val="28"/>
+        </w:rPr>
+      </w:r>
+      <w:r>
+        <w:rPr>
+          <w:rFonts w:ascii="Arial Nova Cond" w:hAnsi="Arial Nova Cond"/>
+          <w:sz w:val="28"/>
+          <w:szCs w:val="28"/>
+        </w:rPr>
       </w:r>
     </w:p>
     <w:p>
       <w:pPr>
         <w:keepLines/>
+        <w:spacing w:before="120" w:after="120" w:line="130" w:lineRule="exact"/>
+        <w:rPr>
+          <w:rFonts w:ascii="Arial Nova Cond" w:hAnsi="Arial Nova Cond"/>
+          <w:sz w:val="28"/>
+          <w:szCs w:val="28"/>
+        </w:rPr>
+      </w:pPr>
+    </w:p>
+    <w:p>
+      <w:pPr>
+        <w:keepLines/>
+        <w:spacing w:before="120" w:after="120" w:line="240" w:lineRule="auto"/>
+        <w:rPr>
+          <w:rFonts w:ascii="Arial Nova Cond" w:hAnsi="Arial Nova Cond"/>
+          <w:sz w:val="28"/>
+          <w:szCs w:val="28"/>
+        </w:rPr>
       </w:pPr>
       <w:r>
-        <w:t>To build Hope Sojourns responsibly, I need partners who believe in this calling. Gifts will help me devote the time and leadership needed to develop trustworthy partnerships, prepare teams and interns, create training resources, provide scholarships, and respond to needs identified by local leaders. We are committed to honest administration and clear stewardship of every gift.</w:t>
+        <w:rPr>
+          <w:rFonts w:ascii="Arial Nova Cond" w:hAnsi="Arial Nova Cond"/>
+          <w:sz w:val="28"/>
+          <w:szCs w:val="28"/>
+        </w:rPr>
+        <w:t xml:space="preserve">To build Hope Sojourns responsibly, I need partners who believe in this calling. </w:t>
+      </w:r>
+      <w:r>
+        <w:rPr>
+          <w:rFonts w:ascii="Arial Nova Cond" w:hAnsi="Arial Nova Cond"/>
+          <w:sz w:val="28"/>
+          <w:szCs w:val="28"/>
+        </w:rPr>
+        <w:t xml:space="preserve">Your partnership will provide for the development of </w:t>
+      </w:r>
+      <w:r>
+        <w:rPr>
+          <w:rFonts w:ascii="Arial Nova Cond" w:hAnsi="Arial Nova Cond"/>
+          <w:sz w:val="28"/>
+          <w:szCs w:val="28"/>
+        </w:rPr>
+        <w:t xml:space="preserve">trustworthy </w:t>
+      </w:r>
+      <w:r>
+        <w:rPr>
+          <w:rFonts w:ascii="Arial Nova Cond" w:hAnsi="Arial Nova Cond"/>
+          <w:sz w:val="28"/>
+          <w:szCs w:val="28"/>
+        </w:rPr>
+        <w:t>teams of missionaries</w:t>
+      </w:r>
+      <w:r>
+        <w:rPr>
+          <w:rFonts w:ascii="Arial Nova Cond" w:hAnsi="Arial Nova Cond"/>
+          <w:sz w:val="28"/>
+          <w:szCs w:val="28"/>
+        </w:rPr>
+        <w:t xml:space="preserve">, interns, and training resources to support those who need help in serving the most vulnerable. </w:t>
       </w:r>
     </w:p>
     <w:p>
       <w:pPr>
         <w:keepLines/>
+        <w:spacing w:before="120" w:after="120" w:line="130" w:lineRule="exact"/>
+        <w:rPr>
+          <w:rFonts w:ascii="Arial Nova Cond" w:hAnsi="Arial Nova Cond"/>
+          <w:sz w:val="28"/>
+          <w:szCs w:val="28"/>
+        </w:rPr>
+      </w:pPr>
+    </w:p>
+    <w:p>
+      <w:pPr>
+        <w:keepLines/>
+        <w:spacing w:before="120" w:after="120" w:line="240" w:lineRule="auto"/>
+        <w:rPr>
+          <w:rFonts w:ascii="Arial Nova Cond" w:hAnsi="Arial Nova Cond"/>
+          <w:sz w:val="28"/>
+          <w:szCs w:val="28"/>
+        </w:rPr>
       </w:pPr>
       <w:r>
         <w:rPr>
+          <w:rFonts w:ascii="Arial Nova Cond" w:hAnsi="Arial Nova Cond"/>
           <w:b/>
+          <w:sz w:val="28"/>
+          <w:szCs w:val="28"/>
         </w:rPr>
+        <w:lastRenderedPageBreak/>
         <w:t xml:space="preserve">Would you prayerfully consider making a one-time gift or becoming a monthly supporter at any level? </w:t>
       </w:r>
       <w:r>
+        <w:rPr>
+          <w:rFonts w:ascii="Arial Nova Cond" w:hAnsi="Arial Nova Cond"/>
+          <w:sz w:val="28"/>
+          <w:szCs w:val="28"/>
+        </w:rPr>
+        <w:t>We are committed to honest administration and clear stewardship of every gift.</w:t>
+      </w:r>
+    </w:p>
+    <w:p>
+      <w:pPr>
+        <w:keepLines/>
+        <w:spacing w:before="120" w:after="120" w:line="130" w:lineRule="exact"/>
+        <w:rPr>
+          <w:rFonts w:ascii="Arial Nova Cond" w:hAnsi="Arial Nova Cond"/>
+          <w:sz w:val="28"/>
+          <w:szCs w:val="28"/>
+        </w:rPr>
+      </w:pPr>
+    </w:p>
+    <w:p>
+      <w:pPr>
+        <w:keepLines/>
+        <w:spacing w:before="120" w:after="120" w:line="240" w:lineRule="auto"/>
+        <w:rPr>
+          <w:rFonts w:ascii="Arial Nova Cond" w:hAnsi="Arial Nova Cond"/>
+          <w:sz w:val="28"/>
+          <w:szCs w:val="28"/>
+        </w:rPr>
+      </w:pPr>
+      <w:r>
+        <w:rPr>
+          <w:rFonts w:ascii="Arial Nova Cond" w:hAnsi="Arial Nova Cond"/>
+          <w:sz w:val="28"/>
+          <w:szCs w:val="28"/>
+        </w:rPr>
         <w:t xml:space="preserve">You can give securely at </w:t>
       </w:r>
-      <w:hyperlink r:id="rId13">
+      <w:hyperlink r:id="rId11">
         <w:r>
           <w:rPr>
+            <w:rFonts w:ascii="Arial Nova Cond" w:hAnsi="Arial Nova Cond"/>
             <w:color w:val="0B5A46"/>
-            <w:szCs w:val="21"/>
+            <w:sz w:val="28"/>
+            <w:szCs w:val="28"/>
             <w:u w:val="single"/>
           </w:rPr>
           <w:t>HopeSojourns.com/giving/</w:t>
         </w:r>
       </w:hyperlink>
       <w:r>
+        <w:rPr>
+          <w:rFonts w:ascii="Arial Nova Cond" w:hAnsi="Arial Nova Cond"/>
+          <w:sz w:val="28"/>
+          <w:szCs w:val="28"/>
+        </w:rPr>
         <w:t>. You may also mail a check to 9408 Harrell Dr, McKinney, TX 75072. Donations are received and controlled by Christian Steps Ministries, a registered 501(c)(3), and are tax-deductible to the extent allowed by law.</w:t>
       </w:r>
     </w:p>
     <w:p>
       <w:pPr>
         <w:keepLines/>
+        <w:spacing w:before="120" w:after="120" w:line="130" w:lineRule="exact"/>
+        <w:rPr>
+          <w:rFonts w:ascii="Arial Nova Cond" w:hAnsi="Arial Nova Cond"/>
+          <w:sz w:val="28"/>
+          <w:szCs w:val="28"/>
+        </w:rPr>
+      </w:pPr>
+    </w:p>
+    <w:p>
+      <w:pPr>
+        <w:keepLines/>
+        <w:spacing w:before="120" w:after="120" w:line="240" w:lineRule="auto"/>
+        <w:rPr>
+          <w:rFonts w:ascii="Arial Nova Cond" w:hAnsi="Arial Nova Cond"/>
+          <w:sz w:val="28"/>
+          <w:szCs w:val="28"/>
+        </w:rPr>
       </w:pPr>
       <w:r>
-        <w:t>Your partnership can also take the form of prayer, sharing Hope Sojourns with others, or introducing me to a pastor or missions leader. I would be glad to talk personally about the vision and the opportunities ahead.</w:t>
+        <w:rPr>
+          <w:rFonts w:ascii="Arial Nova Cond" w:hAnsi="Arial Nova Cond"/>
+          <w:sz w:val="28"/>
+          <w:szCs w:val="28"/>
+        </w:rPr>
+        <w:t xml:space="preserve">Your partnership can also take the form of prayer, sharing Hope Sojourns with others, or introducing me to a pastor or </w:t>
+      </w:r>
+      <w:proofErr w:type="gramStart"/>
+      <w:r>
+        <w:rPr>
+          <w:rFonts w:ascii="Arial Nova Cond" w:hAnsi="Arial Nova Cond"/>
+          <w:sz w:val="28"/>
+          <w:szCs w:val="28"/>
+        </w:rPr>
+        <w:t>missions</w:t>
+      </w:r>
+      <w:proofErr w:type="gramEnd"/>
+      <w:r>
+        <w:rPr>
+          <w:rFonts w:ascii="Arial Nova Cond" w:hAnsi="Arial Nova Cond"/>
+          <w:sz w:val="28"/>
+          <w:szCs w:val="28"/>
+        </w:rPr>
+        <w:t xml:space="preserve"> leader. I would be glad to talk personally about the vision and the opportunities ahead.</w:t>
       </w:r>
     </w:p>
     <w:p>
       <w:pPr>
-        <w:pStyle w:val="Footer"/>
+        <w:keepLines/>
+        <w:spacing w:before="120" w:after="120" w:line="130" w:lineRule="exact"/>
         <w:rPr>
-          <w:sz w:val="16"/>
-          <w:szCs w:val="16"/>
+          <w:rFonts w:ascii="Arial Nova Cond" w:hAnsi="Arial Nova Cond"/>
+          <w:sz w:val="28"/>
+          <w:szCs w:val="28"/>
+        </w:rPr>
+      </w:pPr>
+    </w:p>
+    <w:p>
+      <w:pPr>
+        <w:keepLines/>
+        <w:spacing w:before="120" w:after="120" w:line="240" w:lineRule="auto"/>
+        <w:rPr>
+          <w:rFonts w:ascii="Arial Nova Cond" w:hAnsi="Arial Nova Cond"/>
+          <w:sz w:val="28"/>
+          <w:szCs w:val="28"/>
         </w:rPr>
       </w:pPr>
       <w:r>
+        <w:rPr>
+          <w:rFonts w:ascii="Arial Nova Cond" w:hAnsi="Arial Nova Cond"/>
+          <w:sz w:val="28"/>
+          <w:szCs w:val="28"/>
+        </w:rPr>
         <w:t>Thank you for the ways you have already been part of my life, work, and ministry. I would be grateful to have you beside me in this next chapter</w:t>
       </w:r>
       <w:r>
+        <w:rPr>
+          <w:rFonts w:ascii="Arial Nova Cond" w:hAnsi="Arial Nova Cond"/>
+          <w:sz w:val="28"/>
+          <w:szCs w:val="28"/>
+        </w:rPr>
         <w:t>.</w:t>
       </w:r>
       <w:r>
         <w:rPr>
-          <w:sz w:val="16"/>
-          <w:szCs w:val="16"/>
+          <w:rFonts w:ascii="Arial Nova Cond" w:hAnsi="Arial Nova Cond"/>
+          <w:sz w:val="28"/>
+          <w:szCs w:val="28"/>
         </w:rPr>
         <w:t xml:space="preserve"> </w:t>
       </w:r>
@@ -267,18 +672,29 @@
     <w:p>
       <w:pPr>
         <w:keepLines/>
-        <w:spacing w:after="100"/>
+        <w:spacing w:before="120" w:after="120" w:line="130" w:lineRule="exact"/>
+        <w:rPr>
+          <w:rFonts w:ascii="Arial Nova Cond" w:hAnsi="Arial Nova Cond"/>
+          <w:sz w:val="28"/>
+          <w:szCs w:val="28"/>
+        </w:rPr>
       </w:pPr>
     </w:p>
     <w:p>
       <w:pPr>
         <w:keepLines/>
-        <w:spacing w:after="0" w:line="240" w:lineRule="auto"/>
+        <w:spacing w:before="120" w:after="120" w:line="240" w:lineRule="auto"/>
+        <w:rPr>
+          <w:sz w:val="28"/>
+          <w:szCs w:val="28"/>
+        </w:rPr>
       </w:pPr>
       <w:r>
         <w:rPr>
           <w:i/>
           <w:color w:val="0B3D2E"/>
+          <w:sz w:val="28"/>
+          <w:szCs w:val="28"/>
         </w:rPr>
         <w:t>WitLooL,</w:t>
       </w:r>
@@ -299,11 +715,17 @@
       <w:pPr>
         <w:keepLines/>
         <w:spacing w:after="80" w:line="240" w:lineRule="auto"/>
+        <w:rPr>
+          <w:color w:val="5A5A5A"/>
+          <w:sz w:val="28"/>
+          <w:szCs w:val="28"/>
+        </w:rPr>
       </w:pPr>
       <w:r>
         <w:rPr>
           <w:color w:val="5A5A5A"/>
-          <w:sz w:val="19"/>
+          <w:sz w:val="28"/>
+          <w:szCs w:val="28"/>
         </w:rPr>
         <w:t>Founder, Hope Sojourns</w:t>
       </w:r>
@@ -311,28 +733,57 @@
     <w:p>
       <w:pPr>
         <w:keepLines/>
-        <w:spacing w:before="20" w:after="0" w:line="252" w:lineRule="auto"/>
+        <w:spacing w:after="80" w:line="240" w:lineRule="auto"/>
+        <w:rPr>
+          <w:sz w:val="28"/>
+          <w:szCs w:val="28"/>
+        </w:rPr>
       </w:pPr>
+    </w:p>
+    <w:p>
+      <w:pPr>
+        <w:keepLines/>
+        <w:spacing w:before="20" w:after="60" w:line="252" w:lineRule="auto"/>
+        <w:rPr>
+          <w:color w:val="5A5A5A"/>
+          <w:sz w:val="28"/>
+          <w:szCs w:val="28"/>
+        </w:rPr>
+      </w:pPr>
+      <w:proofErr w:type="gramStart"/>
       <w:r>
         <w:rPr>
           <w:b/>
           <w:color w:val="0B3D2E"/>
-          <w:sz w:val="19"/>
+          <w:sz w:val="28"/>
+          <w:szCs w:val="28"/>
         </w:rPr>
-        <w:t xml:space="preserve">P.S. </w:t>
+        <w:t>P.S</w:t>
+      </w:r>
+      <w:proofErr w:type="gramEnd"/>
+      <w:r>
+        <w:rPr>
+          <w:b/>
+          <w:color w:val="0B3D2E"/>
+          <w:sz w:val="28"/>
+          <w:szCs w:val="28"/>
+        </w:rPr>
+        <w:t xml:space="preserve">. </w:t>
       </w:r>
       <w:r>
         <w:rPr>
           <w:color w:val="5A5A5A"/>
-          <w:sz w:val="19"/>
+          <w:sz w:val="28"/>
+          <w:szCs w:val="28"/>
         </w:rPr>
         <w:t xml:space="preserve">Your gift helps Hope Sojourns build responsible, lasting partnerships that connect willing people with trusted ministries. To learn more or give, visit </w:t>
       </w:r>
-      <w:hyperlink r:id="rId14">
+      <w:hyperlink r:id="rId12">
         <w:r>
           <w:rPr>
             <w:color w:val="0B3D2E"/>
-            <w:szCs w:val="21"/>
+            <w:sz w:val="28"/>
+            <w:szCs w:val="28"/>
             <w:u w:val="single"/>
           </w:rPr>
           <w:t>HopeSojourns.com</w:t>
@@ -341,13 +792,336 @@
       <w:r>
         <w:rPr>
           <w:color w:val="5A5A5A"/>
-          <w:sz w:val="19"/>
+          <w:sz w:val="28"/>
+          <w:szCs w:val="28"/>
         </w:rPr>
         <w:t>.</w:t>
       </w:r>
     </w:p>
+    <w:p>
+      <w:pPr>
+        <w:keepLines/>
+        <w:spacing w:before="20" w:after="60" w:line="252" w:lineRule="auto"/>
+        <w:rPr>
+          <w:color w:val="5A5A5A"/>
+          <w:sz w:val="28"/>
+          <w:szCs w:val="28"/>
+        </w:rPr>
+      </w:pPr>
+    </w:p>
+    <w:p>
+      <w:pPr>
+        <w:pBdr>
+          <w:bottom w:val="dotted" w:sz="10" w:space="2" w:color="A8A8A8"/>
+        </w:pBdr>
+        <w:spacing w:before="20" w:after="40" w:line="240" w:lineRule="auto"/>
+      </w:pPr>
+      <w:proofErr w:type="gramStart"/>
+      <w:r>
+        <w:rPr>
+          <w:rFonts w:ascii="Segoe UI Symbol" w:hAnsi="Segoe UI Symbol"/>
+          <w:color w:val="5A5A5A"/>
+          <w:sz w:val="20"/>
+        </w:rPr>
+        <w:t>✂</w:t>
+      </w:r>
+      <w:r>
+        <w:rPr>
+          <w:rFonts w:ascii="Arial Nova Cond" w:hAnsi="Arial Nova Cond"/>
+          <w:b/>
+          <w:color w:val="5A5A5A"/>
+          <w:sz w:val="17"/>
+        </w:rPr>
+        <w:t xml:space="preserve">  DETACH</w:t>
+      </w:r>
+      <w:proofErr w:type="gramEnd"/>
+      <w:r>
+        <w:rPr>
+          <w:rFonts w:ascii="Arial Nova Cond" w:hAnsi="Arial Nova Cond"/>
+          <w:b/>
+          <w:color w:val="5A5A5A"/>
+          <w:sz w:val="17"/>
+        </w:rPr>
+        <w:t xml:space="preserve"> AND RETURN WITH YOUR GIFT</w:t>
+      </w:r>
+    </w:p>
+    <w:tbl>
+      <w:tblPr>
+        <w:tblW w:w="9878" w:type="dxa"/>
+        <w:tblBorders>
+          <w:top w:val="nil"/>
+          <w:left w:val="nil"/>
+          <w:bottom w:val="nil"/>
+          <w:right w:val="nil"/>
+          <w:insideH w:val="nil"/>
+          <w:insideV w:val="nil"/>
+        </w:tblBorders>
+        <w:tblLayout w:type="fixed"/>
+        <w:tblLook w:val="04A0" w:firstRow="1" w:lastRow="0" w:firstColumn="1" w:lastColumn="0" w:noHBand="0" w:noVBand="1"/>
+      </w:tblPr>
+      <w:tblGrid>
+        <w:gridCol w:w="7280"/>
+        <w:gridCol w:w="2598"/>
+      </w:tblGrid>
+      <w:tr>
+        <w:trPr>
+          <w:cantSplit/>
+        </w:trPr>
+        <w:tc>
+          <w:tcPr>
+            <w:tcW w:w="7280" w:type="dxa"/>
+            <w:tcMar>
+              <w:top w:w="110" w:type="dxa"/>
+              <w:left w:w="75" w:type="dxa"/>
+              <w:bottom w:w="90" w:type="dxa"/>
+              <w:right w:w="125" w:type="dxa"/>
+            </w:tcMar>
+          </w:tcPr>
+          <w:p>
+            <w:pPr>
+              <w:spacing w:after="40" w:line="240" w:lineRule="auto"/>
+            </w:pPr>
+            <w:r>
+              <w:rPr>
+                <w:rFonts w:ascii="Arial Nova Cond" w:hAnsi="Arial Nova Cond"/>
+                <w:b/>
+                <w:color w:val="0B3D2E"/>
+                <w:sz w:val="27"/>
+              </w:rPr>
+              <w:t>MY HOPE SOJOURNS RESPONSE</w:t>
+            </w:r>
+          </w:p>
+          <w:p>
+            <w:pPr>
+              <w:spacing w:after="200" w:line="240" w:lineRule="auto"/>
+            </w:pPr>
+            <w:r>
+              <w:rPr>
+                <w:rFonts w:ascii="Arial Nova Cond" w:hAnsi="Arial Nova Cond"/>
+                <w:i/>
+                <w:color w:val="5A5A5A"/>
+                <w:sz w:val="19"/>
+              </w:rPr>
+              <w:t>Please return this section with your check.</w:t>
+            </w:r>
+          </w:p>
+          <w:p>
+            <w:pPr>
+              <w:spacing w:after="240" w:line="240" w:lineRule="auto"/>
+            </w:pPr>
+            <w:r>
+              <w:rPr>
+                <w:rFonts w:ascii="Arial Nova Cond" w:hAnsi="Arial Nova Cond"/>
+                <w:color w:val="5A5A5A"/>
+              </w:rPr>
+              <w:t>Name: ___________________________________________</w:t>
+            </w:r>
+          </w:p>
+          <w:p>
+            <w:pPr>
+              <w:spacing w:after="240" w:line="240" w:lineRule="auto"/>
+            </w:pPr>
+            <w:r>
+              <w:rPr>
+                <w:rFonts w:ascii="Arial Nova Cond" w:hAnsi="Arial Nova Cond"/>
+                <w:color w:val="5A5A5A"/>
+              </w:rPr>
+              <w:t>Address: _________________________________________</w:t>
+            </w:r>
+          </w:p>
+          <w:p>
+            <w:pPr>
+              <w:spacing w:after="240" w:line="240" w:lineRule="auto"/>
+            </w:pPr>
+            <w:r>
+              <w:rPr>
+                <w:rFonts w:ascii="Arial Nova Cond" w:hAnsi="Arial Nova Cond"/>
+                <w:color w:val="5A5A5A"/>
+              </w:rPr>
+              <w:t>City: _________________  State: _____  ZIP: ________</w:t>
+            </w:r>
+          </w:p>
+          <w:p>
+            <w:pPr>
+              <w:spacing w:after="280" w:line="240" w:lineRule="auto"/>
+            </w:pPr>
+            <w:r>
+              <w:rPr>
+                <w:rFonts w:ascii="Arial Nova Cond" w:hAnsi="Arial Nova Cond"/>
+                <w:color w:val="5A5A5A"/>
+              </w:rPr>
+              <w:t>Email: _______________________  Phone: _____________</w:t>
+            </w:r>
+          </w:p>
+          <w:p>
+            <w:pPr>
+              <w:spacing w:after="240" w:line="240" w:lineRule="auto"/>
+            </w:pPr>
+            <w:r>
+              <w:rPr>
+                <w:rFonts w:ascii="Segoe UI Symbol" w:hAnsi="Segoe UI Symbol"/>
+                <w:color w:val="0B3D2E"/>
+              </w:rPr>
+              <w:t>☐</w:t>
+            </w:r>
+            <w:r>
+              <w:rPr>
+                <w:rFonts w:ascii="Arial Nova Cond" w:hAnsi="Arial Nova Cond"/>
+                <w:color w:val="5A5A5A"/>
+                <w:sz w:val="18"/>
+              </w:rPr>
+              <w:t xml:space="preserve"> One-time gift: $____________     </w:t>
+            </w:r>
+            <w:r>
+              <w:rPr>
+                <w:rFonts w:ascii="Segoe UI Symbol" w:hAnsi="Segoe UI Symbol"/>
+                <w:color w:val="0B3D2E"/>
+              </w:rPr>
+              <w:t>☐</w:t>
+            </w:r>
+            <w:r>
+              <w:rPr>
+                <w:rFonts w:ascii="Arial Nova Cond" w:hAnsi="Arial Nova Cond"/>
+                <w:color w:val="5A5A5A"/>
+                <w:sz w:val="18"/>
+              </w:rPr>
+              <w:t xml:space="preserve"> Monthly commitment: $____________</w:t>
+            </w:r>
+          </w:p>
+          <w:p>
+            <w:pPr>
+              <w:spacing w:after="80" w:line="240" w:lineRule="auto"/>
+            </w:pPr>
+            <w:r>
+              <w:rPr>
+                <w:rFonts w:ascii="Arial Nova Cond" w:hAnsi="Arial Nova Cond"/>
+                <w:b/>
+                <w:color w:val="0B3D2E"/>
+                <w:sz w:val="20"/>
+              </w:rPr>
+              <w:t>Make checks payable to Hope Sojourns.</w:t>
+            </w:r>
+          </w:p>
+          <w:p>
+            <w:pPr>
+              <w:spacing w:after="0" w:line="240" w:lineRule="auto"/>
+            </w:pPr>
+            <w:r>
+              <w:rPr>
+                <w:rFonts w:ascii="Arial Nova Cond" w:hAnsi="Arial Nova Cond"/>
+                <w:color w:val="5A5A5A"/>
+                <w:sz w:val="19"/>
+              </w:rPr>
+              <w:t>Mail to: Hope Sojourns | 9408 Harrell Dr | McKinney, TX 75072</w:t>
+            </w:r>
+          </w:p>
+        </w:tc>
+        <w:tc>
+          <w:tcPr>
+            <w:tcW w:w="2598" w:type="dxa"/>
+            <w:tcMar>
+              <w:top w:w="110" w:type="dxa"/>
+              <w:left w:w="130" w:type="dxa"/>
+              <w:bottom w:w="90" w:type="dxa"/>
+              <w:right w:w="55" w:type="dxa"/>
+            </w:tcMar>
+          </w:tcPr>
+          <w:p>
+            <w:pPr>
+              <w:spacing w:after="60" w:line="240" w:lineRule="auto"/>
+              <w:jc w:val="center"/>
+            </w:pPr>
+            <w:r>
+              <w:rPr>
+                <w:rFonts w:ascii="Arial Nova Cond" w:hAnsi="Arial Nova Cond"/>
+                <w:b/>
+                <w:color w:val="0B3D2E"/>
+                <w:sz w:val="23"/>
+              </w:rPr>
+              <w:t>GIVE ONLINE</w:t>
+            </w:r>
+          </w:p>
+          <w:p>
+            <w:pPr>
+              <w:spacing w:after="100" w:line="240" w:lineRule="auto"/>
+              <w:jc w:val="center"/>
+            </w:pPr>
+            <w:r>
+              <w:rPr>
+                <w:noProof/>
+              </w:rPr>
+              <w:drawing>
+                <wp:inline distT="0" distB="0" distL="0" distR="0" wp14:anchorId="37985679" wp14:editId="6A3A2903">
+                  <wp:extent cx="1353312" cy="1494622"/>
+                  <wp:effectExtent l="0" t="0" r="0" b="0"/>
+                  <wp:docPr id="2" name="HopeSojournsGivingQR" descr="QR code for the Hope Sojourns giving page" title="Hope Sojourns Giving Page"/>
+                  <wp:cNvGraphicFramePr>
+                    <a:graphicFrameLocks xmlns:a="http://schemas.openxmlformats.org/drawingml/2006/main" noChangeAspect="1"/>
+                  </wp:cNvGraphicFramePr>
+                  <a:graphic xmlns:a="http://schemas.openxmlformats.org/drawingml/2006/main">
+                    <a:graphicData uri="http://schemas.openxmlformats.org/drawingml/2006/picture">
+                      <pic:pic xmlns:pic="http://schemas.openxmlformats.org/drawingml/2006/picture">
+                        <pic:nvPicPr>
+                          <pic:cNvPr id="0" name="image.png"/>
+                          <pic:cNvPicPr/>
+                        </pic:nvPicPr>
+                        <pic:blipFill>
+                          <a:blip r:embed="rId13"/>
+                          <a:stretch>
+                            <a:fillRect/>
+                          </a:stretch>
+                        </pic:blipFill>
+                        <pic:spPr>
+                          <a:xfrm>
+                            <a:off x="0" y="0"/>
+                            <a:ext cx="1353312" cy="1494622"/>
+                          </a:xfrm>
+                          <a:prstGeom prst="rect">
+                            <a:avLst/>
+                          </a:prstGeom>
+                        </pic:spPr>
+                      </pic:pic>
+                    </a:graphicData>
+                  </a:graphic>
+                </wp:inline>
+              </w:drawing>
+            </w:r>
+          </w:p>
+          <w:p>
+            <w:pPr>
+              <w:spacing w:after="20" w:line="240" w:lineRule="auto"/>
+              <w:jc w:val="center"/>
+            </w:pPr>
+            <w:r>
+              <w:rPr>
+                <w:rFonts w:ascii="Arial Nova Cond" w:hAnsi="Arial Nova Cond"/>
+                <w:b/>
+                <w:color w:val="0B3D2E"/>
+                <w:sz w:val="18"/>
+              </w:rPr>
+              <w:t>HopeSojourns.com/giving/</w:t>
+            </w:r>
+          </w:p>
+          <w:p>
+            <w:pPr>
+              <w:spacing w:after="0" w:line="240" w:lineRule="auto"/>
+              <w:jc w:val="center"/>
+            </w:pPr>
+            <w:r>
+              <w:rPr>
+                <w:rFonts w:ascii="Arial Nova Cond" w:hAnsi="Arial Nova Cond"/>
+                <w:color w:val="5A5A5A"/>
+                <w:sz w:val="17"/>
+              </w:rPr>
+              <w:t>Secure online giving</w:t>
+            </w:r>
+          </w:p>
+        </w:tc>
+      </w:tr>
+    </w:tbl>
+    <w:p/>
     <w:sectPr>
-      <w:footerReference w:type="default" r:id="rId15"/>
+      <w:footerReference w:type="default" r:id="rId14"/>
       <w:pgSz w:w="12240" w:h="15840"/>
       <w:pgMar w:top="893" w:right="1181" w:bottom="893" w:left="1181" w:header="432" w:footer="432" w:gutter="0"/>
       <w:cols w:space="720"/>
@@ -424,7 +1198,11 @@
       </w:rPr>
     </w:pPr>
     <w:r>
-      <w:t xml:space="preserve">9408 Harrell Dr McKinney, TX 75072 |  </w:t>
+      <w:t xml:space="preserve">9408 Harrell Dr McKinney, TX 75072 </w:t>
+    </w:r>
+    <w:proofErr w:type="gramStart"/>
+    <w:r>
+      <w:t xml:space="preserve">|  </w:t>
     </w:r>
     <w:r>
       <w:t>HopeSojourns.</w:t>
@@ -432,6 +1210,7 @@
     <w:r>
       <w:t>com</w:t>
     </w:r>
+    <w:proofErr w:type="gramEnd"/>
   </w:p>
   <w:p>
     <w:pPr>

</xml_diff>